<commit_message>
docs(plan): submission deadline moved to 20 Sep 2026 23:59
Forward-looking statements updated: README, capstone-conventions skill,
Stage 4 Table 1 (week three row) and the B-27 definition of done. Historical
entries that were true when written (the 11 Sep day plan, the Stage 5 log's
reasoning) are left as written.

Stage 4 Table 7: 2026-09-17 check-in covering 13-17 Sep from git history,
and the remaining order B-22, B-23, B-25, B-26, B-27 with B-29 first to cut.

PRD Open Q4 still names the 13 September deadline; changing it is a PRD
revision and goes through the Stage 5 log in B-22.

Co-Authored-By: Claude Opus 5 <noreply@anthropic.com>
</commit_message>
<xml_diff>
--- a/workbooks/Stage_4_Sprint_Plan.docx
+++ b/workbooks/Stage_4_Sprint_Plan.docx
@@ -669,7 +669,7 @@
               <w:rPr>
                 <w:sz w:val="17"/>
               </w:rPr>
-              <w:t>Governance + report + video + submission. Submit Sat 13 before 23:59 (time zone open per PRD Open Q4).</w:t>
+              <w:t>Governance + report + video + submission. Submission moved to Sun 20 Sep 23:59 (was Sat 13 Sep; time zone still open per PRD Open Q4).</w:t>
             </w:r>
           </w:p>
         </w:tc>
@@ -4625,7 +4625,7 @@
               <w:rPr>
                 <w:sz w:val="15"/>
               </w:rPr>
-              <w:t>FirstnameLastname_Capstone_Submission.zip with four folders (Video/Report/Workbooks/Source_Code). Uploaded before 13 Sep 23:59 (time zone: assumption; open Q4 in PRD).</w:t>
+              <w:t>FirstnameLastname_Capstone_Submission.zip with four folders (Video/Report/Workbooks/Source_Code). Uploaded before 20 Sep 23:59 (moved from 13 Sep) (time zone: assumption; open Q4 in PRD).</w:t>
             </w:r>
           </w:p>
         </w:tc>
@@ -7909,6 +7909,96 @@
               <w:rPr>
                 <w:sz w:val="16"/>
               </w:rPr>
+            </w:r>
+          </w:p>
+        </w:tc>
+      </w:tr>
+      <w:tr>
+        <w:tc>
+          <w:tcPr>
+            <w:tcW w:type="dxa" w:w="1296"/>
+            <w:tcBorders>
+              <w:top w:val="single" w:sz="6" w:color="D9D9E0"/>
+              <w:left w:val="single" w:sz="6" w:color="D9D9E0"/>
+              <w:bottom w:val="single" w:sz="6" w:color="D9D9E0"/>
+              <w:right w:val="single" w:sz="6" w:color="D9D9E0"/>
+            </w:tcBorders>
+          </w:tcPr>
+          <w:p>
+            <w:pPr>
+              <w:spacing w:before="50" w:after="50"/>
+            </w:pPr>
+            <w:r>
+              <w:rPr>
+                <w:sz w:val="16"/>
+              </w:rPr>
+              <w:t>2026-09-17 (Thu)</w:t>
+            </w:r>
+          </w:p>
+        </w:tc>
+        <w:tc>
+          <w:tcPr>
+            <w:tcW w:type="dxa" w:w="3168"/>
+            <w:tcBorders>
+              <w:top w:val="single" w:sz="6" w:color="D9D9E0"/>
+              <w:left w:val="single" w:sz="6" w:color="D9D9E0"/>
+              <w:bottom w:val="single" w:sz="6" w:color="D9D9E0"/>
+              <w:right w:val="single" w:sz="6" w:color="D9D9E0"/>
+            </w:tcBorders>
+          </w:tcPr>
+          <w:p>
+            <w:pPr>
+              <w:spacing w:before="50" w:after="50"/>
+            </w:pPr>
+            <w:r>
+              <w:rPr>
+                <w:sz w:val="16"/>
+              </w:rPr>
+              <w:t>Covers 13-17 Sep from git history; the 7-12 Sep check-ins were not filled in. Guardrail fixes: PII check no longer blocks on its own citation markers; fail-safe blocks reported separately from real findings; citation markers stripped from customer replies; an unidentified intent never auto-responds; answer-relevance guardrail added. PR-GENERATE-01 v3.1 rejected by the pre-registered A/B; v2.0 kept. B-21 gate re-run clean on OpenAI, 80 tickets (14 Sep), and again with a Gemini guardrail judge (15 Sep). B-24 fairness audit run. B-17 PR-EVAL-JUDGE-01 v1.1 written. B-18 50 items scored blind; judge NOT trusted (pooled Spearman 0.35 against the 0.70 floor). Retrieval eval: hit@k, MRR, NDCG, recall@k by intent; citation precision/recall added to the harness report.</w:t>
+            </w:r>
+          </w:p>
+        </w:tc>
+        <w:tc>
+          <w:tcPr>
+            <w:tcW w:type="dxa" w:w="3168"/>
+            <w:tcBorders>
+              <w:top w:val="single" w:sz="6" w:color="D9D9E0"/>
+              <w:left w:val="single" w:sz="6" w:color="D9D9E0"/>
+              <w:bottom w:val="single" w:sz="6" w:color="D9D9E0"/>
+              <w:right w:val="single" w:sz="6" w:color="D9D9E0"/>
+            </w:tcBorders>
+          </w:tcPr>
+          <w:p>
+            <w:pPr>
+              <w:spacing w:before="50" w:after="50"/>
+            </w:pPr>
+            <w:r>
+              <w:rPr>
+                <w:sz w:val="16"/>
+              </w:rPr>
+              <w:t>Submission deadline moved to Sun 20 Sep 23:59 (time zone still open, PRD Open Q4). Remaining order: B-22 close (Stage 5 entries since 12 Sep, the four reflection questions, traceability audit), then B-23 governance framework, B-25 report, B-26 video, B-27 packaging; about 22h of estimated work. B-29 src/api.py stays first to cut.</w:t>
+            </w:r>
+          </w:p>
+        </w:tc>
+        <w:tc>
+          <w:tcPr>
+            <w:tcW w:type="dxa" w:w="2016"/>
+            <w:tcBorders>
+              <w:top w:val="single" w:sz="6" w:color="D9D9E0"/>
+              <w:left w:val="single" w:sz="6" w:color="D9D9E0"/>
+              <w:bottom w:val="single" w:sz="6" w:color="D9D9E0"/>
+              <w:right w:val="single" w:sz="6" w:color="D9D9E0"/>
+            </w:tcBorders>
+          </w:tcPr>
+          <w:p>
+            <w:pPr>
+              <w:spacing w:before="50" w:after="50"/>
+            </w:pPr>
+            <w:r>
+              <w:rPr>
+                <w:sz w:val="16"/>
+              </w:rPr>
+              <w:t>None</w:t>
             </w:r>
           </w:p>
         </w:tc>

</xml_diff>